<commit_message>
Fix team member name: Carlos Ramos → Carlo Ramos
Updated in all 6 Java file headers, README, PROJECT_OVERVIEW,
gen_flujogramas.py, gen_informe.py, and regenerated both
docs/Flujogramas_COMP2315.pdf and docs/Informe_ProyectoFinal_COMP2315.docx.

Co-Authored-By: Claude Sonnet 4.6 <noreply@anthropic.com>
</commit_message>
<xml_diff>
--- a/docs/Informe_ProyectoFinal_COMP2315.docx
+++ b/docs/Informe_ProyectoFinal_COMP2315.docx
@@ -162,7 +162,7 @@
           <w:i w:val="0"/>
           <w:sz w:val="24"/>
         </w:rPr>
-        <w:t>Carlos Ramos</w:t>
+        <w:t>Carlo Ramos</w:t>
       </w:r>
       <w:r>
         <w:rPr>
@@ -1753,7 +1753,7 @@
               </w:rPr>
               <w:t>Donovan Irizarry</w:t>
               <w:br/>
-              <w:t>Carlos Ramos</w:t>
+              <w:t>Carlo Ramos</w:t>
             </w:r>
           </w:p>
         </w:tc>
@@ -3587,7 +3587,7 @@
         <w:br/>
         <w:t xml:space="preserve"> *            Donovan Irizarry Figueroa - A00671799</w:t>
         <w:br/>
-        <w:t xml:space="preserve"> *            Carlos Ramos - A00642991</w:t>
+        <w:t xml:space="preserve"> *            Carlo Ramos - A00642991</w:t>
         <w:br/>
         <w:t xml:space="preserve"> * Curso: COMP 2315 - Programación Estructurada</w:t>
         <w:br/>
@@ -3861,7 +3861,7 @@
         <w:br/>
         <w:t xml:space="preserve"> *            Donovan Irizarry Figueroa - A00671799</w:t>
         <w:br/>
-        <w:t xml:space="preserve"> *            Carlos Ramos - A00642991</w:t>
+        <w:t xml:space="preserve"> *            Carlo Ramos - A00642991</w:t>
         <w:br/>
         <w:t xml:space="preserve"> * Curso: COMP 2315 - Programación Estructurada</w:t>
         <w:br/>
@@ -4351,7 +4351,7 @@
         <w:br/>
         <w:t xml:space="preserve"> *            Donovan Irizarry Figueroa - A00671799</w:t>
         <w:br/>
-        <w:t xml:space="preserve"> *            Carlos Ramos - A00642991</w:t>
+        <w:t xml:space="preserve"> *            Carlo Ramos - A00642991</w:t>
         <w:br/>
         <w:t xml:space="preserve"> * Curso: COMP 2315 - Programación Estructurada</w:t>
         <w:br/>
@@ -4829,7 +4829,7 @@
         <w:br/>
         <w:t xml:space="preserve"> *            Donovan Irizarry Figueroa - A00671799</w:t>
         <w:br/>
-        <w:t xml:space="preserve"> *            Carlos Ramos - A00642991</w:t>
+        <w:t xml:space="preserve"> *            Carlo Ramos - A00642991</w:t>
         <w:br/>
         <w:t xml:space="preserve"> * Curso: COMP 2315 - Programación Estructurada</w:t>
         <w:br/>
@@ -5327,7 +5327,7 @@
         <w:br/>
         <w:t xml:space="preserve"> *            Donovan Irizarry Figueroa - A00671799</w:t>
         <w:br/>
-        <w:t xml:space="preserve"> *            Carlos Ramos - A00642991</w:t>
+        <w:t xml:space="preserve"> *            Carlo Ramos - A00642991</w:t>
         <w:br/>
         <w:t xml:space="preserve"> * Curso: COMP 2315 - Programación Estructurada</w:t>
         <w:br/>
@@ -6993,7 +6993,7 @@
         <w:br/>
         <w:t xml:space="preserve"> *            Donovan Irizarry Figueroa - A00671799</w:t>
         <w:br/>
-        <w:t xml:space="preserve"> *            Carlos Ramos - A00642991</w:t>
+        <w:t xml:space="preserve"> *            Carlo Ramos - A00642991</w:t>
         <w:br/>
         <w:t xml:space="preserve"> * Curso: COMP 2315 - Programación Estructurada</w:t>
         <w:br/>
@@ -7091,7 +7091,7 @@
         <w:br/>
         <w:t xml:space="preserve">            "    * Donovan Irizarry Figueroa - A00671799\n"             +</w:t>
         <w:br/>
-        <w:t xml:space="preserve">            "    * Carlos Ramos              - A00642991\n\n"           +</w:t>
+        <w:t xml:space="preserve">            "    * Carlo Ramos              - A00642991\n\n"           +</w:t>
         <w:br/>
         <w:t xml:space="preserve">            "  COMP 2315 - Programacion Estructurada\n"                 +</w:t>
         <w:br/>

</xml_diff>